<commit_message>
docs: Pennsylvania Supreme Court fan-out results and what it found; layout.yaml grammar: heading numbers, field defaults, body_words (fb-595.54.13)
</commit_message>
<xml_diff>
--- a/courts/third-circuit/pennsylvania/state/supreme-court/amicus-brief/usage/OUTPUT-amicus-brief.docx
+++ b/courts/third-circuit/pennsylvania/state/supreme-court/amicus-brief/usage/OUTPUT-amicus-brief.docx
@@ -7028,7 +7028,7 @@
         <w:t xml:space="preserve"> </w:t>
       </w:r>
       <w:r>
-        <w:t xml:space="preserve">Testimony Presented to Senate Judiciary Committee by Professor Louis S. Rulli, University of Pennsylvania Law School (October 20, 2015) at 20, http://​​www.senatorgreenleaf.com/​​wpcontent/​​blogs.dir/​​39/​​files/​​2015/​​10/​​Testiinony-of-Louis-Rulli.pdf.</w:t>
+        <w:t xml:space="preserve">Testimony Presented to Senate Judiciary Committee by Professor Louis S. Rulli, University of Pennsylvania Law School (October 20, 2015) at 20, http://​​www.​senatorgreenleaf.​com/​​wpcontent/​​blogs.​dir/​​39/​​files/​​2015/​​10/​​Testiinony-​of-​Louis-​Rulli.​pdf.</w:t>
       </w:r>
     </w:p>
   </w:footnote>
@@ -7104,7 +7104,7 @@
         <w:t xml:space="preserve"> </w:t>
       </w:r>
       <w:r>
-        <w:t xml:space="preserve">See Christopher Ingraham, In tough times, police start seizing a lot more stuff from people, The Washington Post (Nov. 10, 2015), https://​​www.washingtonpost.com/​​news/​​wonk/​​wp/​​2015/​​11/​​10/​​report-in-lean-times-police-start-taking-a-lot-more-stuff-frompeople/​​.</w:t>
+        <w:t xml:space="preserve">See Christopher Ingraham, In tough times, police start seizing a lot more stuff from people, The Washington Post (Nov. 10, 2015), https://​​www.​washingtonpost.​com/​​news/​​wonk/​​wp/​​2015/​​11/​​10/​​report-​in-​lean-​times-​police-​start-​taking-​a-​lot-​more-​stuff-​frompeople/​​.</w:t>
       </w:r>
     </w:p>
   </w:footnote>
@@ -7186,7 +7186,7 @@
         <w:t xml:space="preserve"> </w:t>
       </w:r>
       <w:r>
-        <w:t xml:space="preserve">Scott Kelly, American Civil Liberties Union of Pennsylvania, Guilty Property—How Law Enforcement Takes $1 Million in Cash from Innocent Philadelphians Every Year—and Gets Away With It (June 2015), http://​​www.aclupa.org/​​forfeiture (hereinafter “ACLU-PA, Guilty Property”) at 8.</w:t>
+        <w:t xml:space="preserve">Scott Kelly, American Civil Liberties Union of Pennsylvania, Guilty Property—How Law Enforcement Takes $1 Million in Cash from Innocent Philadelphians Every Year—and Gets Away With It (June 2015), http://​​www.​aclupa.​org/​​forfeiture (hereinafter “ACLU-PA, Guilty Property”) at 8.</w:t>
       </w:r>
     </w:p>
   </w:footnote>
@@ -7205,7 +7205,7 @@
         <w:t xml:space="preserve"> </w:t>
       </w:r>
       <w:r>
-        <w:t xml:space="preserve">Poverty Rate by Race/​Ethnicity, Henry J. Kaiser Family Foundation, http://​​kff.org/​​other/​​state-indicator/​​povertyrate-by-raceethnicity/ (13% of Pennsylvanians live in poverty, including 9% of white Pennsylvanians, 25% of African-American Pennsylvanians, and 29% of Hispanic Pennsylvanians).</w:t>
+        <w:t xml:space="preserve">Poverty Rate by Race/​Ethnicity, Henry J. Kaiser Family Foundation, http://​​kff.​org/​​other/​​state-​indicator/​​povertyrate-​by-​raceethnicity/ (13% of Pennsylvanians live in poverty, including 9% of white Pennsylvanians, 25% of African-American Pennsylvanians, and 29% of Hispanic Pennsylvanians).</w:t>
       </w:r>
     </w:p>
   </w:footnote>
@@ -7255,7 +7255,7 @@
         <w:t xml:space="preserve"> </w:t>
       </w:r>
       <w:r>
-        <w:t xml:space="preserve">See Michael Sallah, Robert O’Harrow Jr., Steven Rich, &amp; Gabe Silverman, Stop and Seize, The Washington Post (Sept. 6, 2014), http://​​www.washingtonpost.com/​​sf/​​investigative/​​2014/​​09/​​06/​​stop-and-seize/​​.</w:t>
+        <w:t xml:space="preserve">See Michael Sallah, Robert O’Harrow Jr., Steven Rich, &amp; Gabe Silverman, Stop and Seize, The Washington Post (Sept. 6, 2014), http://​​www.​washingtonpost.​com/​​sf/​​investigative/​​2014/​​09/​​06/​​stop-​and-​seize/​​.</w:t>
       </w:r>
     </w:p>
   </w:footnote>
@@ -7331,7 +7331,7 @@
         <w:t xml:space="preserve"> </w:t>
       </w:r>
       <w:r>
-        <w:t xml:space="preserve">Scott Kelly, American Civil Liberties Union of Pennsylvania, Broken Justice—An Investigation of Civil Asset Forfeiture in Montgomery County, 6 &amp; n.22 (October 2015), http://​​www.aclupa.org/​​forfeiture.</w:t>
+        <w:t xml:space="preserve">Scott Kelly, American Civil Liberties Union of Pennsylvania, Broken Justice—An Investigation of Civil Asset Forfeiture in Montgomery County, 6 &amp; n.22 (October 2015), http://​​www.​aclupa.​org/​​forfeiture.</w:t>
       </w:r>
     </w:p>
   </w:footnote>
@@ -7369,7 +7369,7 @@
         <w:t xml:space="preserve"> </w:t>
       </w:r>
       <w:r>
-        <w:t xml:space="preserve">Scott Kelly, American Civil Liberties Union of Pennsylvania, Forfeiture in the Shadows—An Investigation of Civil Asset Forfeiture in Cumberland County, 5 &amp; n.24 (December 2015), http://​​www.aclupa.org/​​forfeiture.</w:t>
+        <w:t xml:space="preserve">Scott Kelly, American Civil Liberties Union of Pennsylvania, Forfeiture in the Shadows—An Investigation of Civil Asset Forfeiture in Cumberland County, 5 &amp; n.24 (December 2015), http://​​www.​aclupa.​org/​​forfeiture.</w:t>
       </w:r>
     </w:p>
   </w:footnote>
@@ -7388,7 +7388,7 @@
         <w:t xml:space="preserve"> </w:t>
       </w:r>
       <w:r>
-        <w:t xml:space="preserve">See John Yoder &amp; Brad Cates, Government Self-Interest Corrupted a Crime-Fighting Tool into an Evil, The Washington Post (Sept. 18, 2014), https://​​www.washingtonpost.com/​​opinions/​​abolish-the-civil-asset-forfeiture-program-wehelped-create/​​2014/​​09/​​18/​​72f089ac</w:t>
+        <w:t xml:space="preserve">See John Yoder &amp; Brad Cates, Government Self-Interest Corrupted a Crime-Fighting Tool into an Evil, The Washington Post (Sept. 18, 2014), https://​​www.​washingtonpost.​com/​​opinions/​​abolish-​the-​civil-​asset-​forfeiture-​program-​wehelped-​create/​​2014/​​09/​​18/​​72f089ac</w:t>
       </w:r>
       <w:r>
         <w:noBreakHyphen/>
@@ -7400,13 +7400,13 @@
         <w:noBreakHyphen/>
       </w:r>
       <w:r>
-        <w:t xml:space="preserve">11e4-b0ea</w:t>
+        <w:t xml:space="preserve">11e4-​b0ea</w:t>
       </w:r>
       <w:r>
         <w:noBreakHyphen/>
       </w:r>
       <w:r>
-        <w:t xml:space="preserve">8141703bbf6f_story.html (“The program began with good intentions but now, having failed in both purpose and execution, it should be abolished”).</w:t>
+        <w:t xml:space="preserve">8141703bbf6f_story.​html (“The program began with good intentions but now, having failed in both purpose and execution, it should be abolished”).</w:t>
       </w:r>
     </w:p>
   </w:footnote>

</xml_diff>